<commit_message>
Update CST 326 Milestone 4 Version Description.docx
</commit_message>
<xml_diff>
--- a/Milestone 4/CST 326 Milestone 4 Version Description.docx
+++ b/Milestone 4/CST 326 Milestone 4 Version Description.docx
@@ -1,6 +1,6 @@
 
 <file path=word/document.xml><?xml version="1.0" encoding="utf-8"?>
-<w:document xmlns:wpc="http://schemas.microsoft.com/office/word/2010/wordprocessingCanvas" xmlns:cx="http://schemas.microsoft.com/office/drawing/2014/chartex" xmlns:cx1="http://schemas.microsoft.com/office/drawing/2015/9/8/chartex" xmlns:cx2="http://schemas.microsoft.com/office/drawing/2015/10/21/chartex" xmlns:cx3="http://schemas.microsoft.com/office/drawing/2016/5/9/chartex" xmlns:cx4="http://schemas.microsoft.com/office/drawing/2016/5/10/chartex" xmlns:cx5="http://schemas.microsoft.com/office/drawing/2016/5/11/chartex" xmlns:cx6="http://schemas.microsoft.com/office/drawing/2016/5/12/chartex" xmlns:cx7="http://schemas.microsoft.com/office/drawing/2016/5/13/chartex" xmlns:cx8="http://schemas.microsoft.com/office/drawing/2016/5/14/chartex" xmlns:mc="http://schemas.openxmlformats.org/markup-compatibility/2006" xmlns:aink="http://schemas.microsoft.com/office/drawing/2016/ink" xmlns:am3d="http://schemas.microsoft.com/office/drawing/2017/model3d" xmlns:o="urn:schemas-microsoft-com:office:office" xmlns:oel="http://schemas.microsoft.com/office/2019/extlst" xmlns:r="http://schemas.openxmlformats.org/officeDocument/2006/relationships" xmlns:m="http://schemas.openxmlformats.org/officeDocument/2006/math" xmlns:v="urn:schemas-microsoft-com:vml" xmlns:wp14="http://schemas.microsoft.com/office/word/2010/wordprocessingDrawing" xmlns:wp="http://schemas.openxmlformats.org/drawingml/2006/wordprocessingDrawing" xmlns:w10="urn:schemas-microsoft-com:office:word" xmlns:w="http://schemas.openxmlformats.org/wordprocessingml/2006/main" xmlns:w14="http://schemas.microsoft.com/office/word/2010/wordml" xmlns:w15="http://schemas.microsoft.com/office/word/2012/wordml" xmlns:w16cex="http://schemas.microsoft.com/office/word/2018/wordml/cex" xmlns:w16cid="http://schemas.microsoft.com/office/word/2016/wordml/cid" xmlns:w16="http://schemas.microsoft.com/office/word/2018/wordml" xmlns:w16du="http://schemas.microsoft.com/office/word/2023/wordml/word16du" xmlns:w16sdtdh="http://schemas.microsoft.com/office/word/2020/wordml/sdtdatahash" xmlns:w16sdtfl="http://schemas.microsoft.com/office/word/2024/wordml/sdtformatlock" xmlns:w16se="http://schemas.microsoft.com/office/word/2015/wordml/symex" xmlns:wpg="http://schemas.microsoft.com/office/word/2010/wordprocessingGroup" xmlns:wpi="http://schemas.microsoft.com/office/word/2010/wordprocessingInk" xmlns:wne="http://schemas.microsoft.com/office/word/2006/wordml" xmlns:wps="http://schemas.microsoft.com/office/word/2010/wordprocessingShape" mc:Ignorable="w14 w15 w16se w16cid w16 w16cex w16sdtdh w16sdtfl w16du wp14">
+<w:document xmlns:wpc="http://schemas.microsoft.com/office/word/2010/wordprocessingCanvas" xmlns:cx="http://schemas.microsoft.com/office/drawing/2014/chartex" xmlns:cx1="http://schemas.microsoft.com/office/drawing/2015/9/8/chartex" xmlns:cx2="http://schemas.microsoft.com/office/drawing/2015/10/21/chartex" xmlns:cx3="http://schemas.microsoft.com/office/drawing/2016/5/9/chartex" xmlns:cx4="http://schemas.microsoft.com/office/drawing/2016/5/10/chartex" xmlns:cx5="http://schemas.microsoft.com/office/drawing/2016/5/11/chartex" xmlns:cx6="http://schemas.microsoft.com/office/drawing/2016/5/12/chartex" xmlns:cx7="http://schemas.microsoft.com/office/drawing/2016/5/13/chartex" xmlns:cx8="http://schemas.microsoft.com/office/drawing/2016/5/14/chartex" xmlns:mc="http://schemas.openxmlformats.org/markup-compatibility/2006" xmlns:m="http://schemas.openxmlformats.org/officeDocument/2006/math" xmlns:aink="http://schemas.microsoft.com/office/drawing/2016/ink" xmlns:am3d="http://schemas.microsoft.com/office/drawing/2017/model3d" xmlns:oel="http://schemas.microsoft.com/office/2019/extlst" xmlns:r="http://schemas.openxmlformats.org/officeDocument/2006/relationships" xmlns:wp14="http://schemas.microsoft.com/office/word/2010/wordprocessingDrawing" xmlns:wp="http://schemas.openxmlformats.org/drawingml/2006/wordprocessingDrawing" xmlns:wpg="http://schemas.microsoft.com/office/word/2010/wordprocessingGroup" xmlns:wpi="http://schemas.microsoft.com/office/word/2010/wordprocessingInk" xmlns:wps="http://schemas.microsoft.com/office/word/2010/wordprocessingShape" xmlns:o="urn:schemas-microsoft-com:office:office" xmlns:v="urn:schemas-microsoft-com:vml" xmlns:w10="urn:schemas-microsoft-com:office:word" xmlns:w="http://schemas.openxmlformats.org/wordprocessingml/2006/main" xmlns:w14="http://schemas.microsoft.com/office/word/2010/wordml" xmlns:w15="http://schemas.microsoft.com/office/word/2012/wordml" xmlns:w16cex="http://schemas.microsoft.com/office/word/2018/wordml/cex" xmlns:w16cid="http://schemas.microsoft.com/office/word/2016/wordml/cid" xmlns:w16="http://schemas.microsoft.com/office/word/2018/wordml" xmlns:w16sdtdh="http://schemas.microsoft.com/office/word/2020/wordml/sdtdatahash" xmlns:w16sdtfl="http://schemas.microsoft.com/office/word/2024/wordml/sdtformatlock" xmlns:w16se="http://schemas.microsoft.com/office/word/2015/wordml/symex" xmlns:w16du="http://schemas.microsoft.com/office/word/2023/wordml/word16du" xmlns:wne="http://schemas.microsoft.com/office/word/2006/wordml" mc:Ignorable="w14 w15 w16se w16cid w16 w16cex w16sdtdh w16sdtfl w16du wp14">
   <w:body>
     <w:p>
       <w:pPr>
@@ -65,10 +65,55 @@
       </w:r>
     </w:p>
     <w:p>
+      <w:r>
+        <w:drawing>
+          <wp:inline distT="0" distB="0" distL="0" distR="0" wp14:anchorId="4FA41225" wp14:editId="546EB5A8">
+            <wp:extent cx="6217920" cy="3578860"/>
+            <wp:effectExtent l="0" t="0" r="5080" b="2540"/>
+            <wp:docPr id="1922475895" name="Picture 1"/>
+            <wp:cNvGraphicFramePr>
+              <a:graphicFrameLocks xmlns:a="http://schemas.openxmlformats.org/drawingml/2006/main" noChangeAspect="1"/>
+            </wp:cNvGraphicFramePr>
+            <a:graphic xmlns:a="http://schemas.openxmlformats.org/drawingml/2006/main">
+              <a:graphicData uri="http://schemas.openxmlformats.org/drawingml/2006/picture">
+                <pic:pic xmlns:pic="http://schemas.openxmlformats.org/drawingml/2006/picture">
+                  <pic:nvPicPr>
+                    <pic:cNvPr id="1922475895" name=""/>
+                    <pic:cNvPicPr/>
+                  </pic:nvPicPr>
+                  <pic:blipFill>
+                    <a:blip r:embed="rId6"/>
+                    <a:stretch>
+                      <a:fillRect/>
+                    </a:stretch>
+                  </pic:blipFill>
+                  <pic:spPr>
+                    <a:xfrm>
+                      <a:off x="0" y="0"/>
+                      <a:ext cx="6217920" cy="3578860"/>
+                    </a:xfrm>
+                    <a:prstGeom prst="rect">
+                      <a:avLst/>
+                    </a:prstGeom>
+                  </pic:spPr>
+                </pic:pic>
+              </a:graphicData>
+            </a:graphic>
+          </wp:inline>
+        </w:drawing>
+      </w:r>
+    </w:p>
+    <w:p>
+      <w:r>
+        <w:t>Figure 1: Screenshot of the GitHub Sprint Table.</w:t>
+      </w:r>
+    </w:p>
+    <w:p>
       <w:pPr>
         <w:pStyle w:val="Heading1"/>
       </w:pPr>
       <w:r>
+        <w:lastRenderedPageBreak/>
         <w:t>List of Known Issues</w:t>
       </w:r>
     </w:p>
@@ -137,7 +182,11 @@
             <w:cnfStyle w:val="001000000000" w:firstRow="0" w:lastRow="0" w:firstColumn="1" w:lastColumn="0" w:oddVBand="0" w:evenVBand="0" w:oddHBand="0" w:evenHBand="0" w:firstRowFirstColumn="0" w:firstRowLastColumn="0" w:lastRowFirstColumn="0" w:lastRowLastColumn="0"/>
             <w:tcW w:w="3264" w:type="dxa"/>
           </w:tcPr>
-          <w:p/>
+          <w:p>
+            <w:r>
+              <w:t>1</w:t>
+            </w:r>
+          </w:p>
         </w:tc>
         <w:tc>
           <w:tcPr>
@@ -160,6 +209,9 @@
             <w:pPr>
               <w:cnfStyle w:val="000000100000" w:firstRow="0" w:lastRow="0" w:firstColumn="0" w:lastColumn="0" w:oddVBand="0" w:evenVBand="0" w:oddHBand="1" w:evenHBand="0" w:firstRowFirstColumn="0" w:firstRowLastColumn="0" w:lastRowFirstColumn="0" w:lastRowLastColumn="0"/>
             </w:pPr>
+            <w:r>
+              <w:t>Open; scheduled for future sprint pending client decision</w:t>
+            </w:r>
           </w:p>
         </w:tc>
       </w:tr>
@@ -172,7 +224,11 @@
             <w:cnfStyle w:val="001000000000" w:firstRow="0" w:lastRow="0" w:firstColumn="1" w:lastColumn="0" w:oddVBand="0" w:evenVBand="0" w:oddHBand="0" w:evenHBand="0" w:firstRowFirstColumn="0" w:firstRowLastColumn="0" w:lastRowFirstColumn="0" w:lastRowLastColumn="0"/>
             <w:tcW w:w="3264" w:type="dxa"/>
           </w:tcPr>
-          <w:p/>
+          <w:p>
+            <w:r>
+              <w:t>2</w:t>
+            </w:r>
+          </w:p>
         </w:tc>
         <w:tc>
           <w:tcPr>
@@ -195,6 +251,9 @@
             <w:pPr>
               <w:cnfStyle w:val="000000000000" w:firstRow="0" w:lastRow="0" w:firstColumn="0" w:lastColumn="0" w:oddVBand="0" w:evenVBand="0" w:oddHBand="0" w:evenHBand="0" w:firstRowFirstColumn="0" w:firstRowLastColumn="0" w:lastRowFirstColumn="0" w:lastRowLastColumn="0"/>
             </w:pPr>
+            <w:r>
+              <w:t>Open; scheduled for future sprint pending client decision</w:t>
+            </w:r>
           </w:p>
         </w:tc>
       </w:tr>
@@ -208,7 +267,11 @@
             <w:cnfStyle w:val="001000000000" w:firstRow="0" w:lastRow="0" w:firstColumn="1" w:lastColumn="0" w:oddVBand="0" w:evenVBand="0" w:oddHBand="0" w:evenHBand="0" w:firstRowFirstColumn="0" w:firstRowLastColumn="0" w:lastRowFirstColumn="0" w:lastRowLastColumn="0"/>
             <w:tcW w:w="3264" w:type="dxa"/>
           </w:tcPr>
-          <w:p/>
+          <w:p>
+            <w:r>
+              <w:t>3</w:t>
+            </w:r>
+          </w:p>
         </w:tc>
         <w:tc>
           <w:tcPr>
@@ -231,6 +294,9 @@
             <w:pPr>
               <w:cnfStyle w:val="000000100000" w:firstRow="0" w:lastRow="0" w:firstColumn="0" w:lastColumn="0" w:oddVBand="0" w:evenVBand="0" w:oddHBand="1" w:evenHBand="0" w:firstRowFirstColumn="0" w:firstRowLastColumn="0" w:lastRowFirstColumn="0" w:lastRowLastColumn="0"/>
             </w:pPr>
+            <w:r>
+              <w:t>Open; scheduled for future sprint</w:t>
+            </w:r>
           </w:p>
         </w:tc>
       </w:tr>
@@ -243,7 +309,11 @@
             <w:cnfStyle w:val="001000000000" w:firstRow="0" w:lastRow="0" w:firstColumn="1" w:lastColumn="0" w:oddVBand="0" w:evenVBand="0" w:oddHBand="0" w:evenHBand="0" w:firstRowFirstColumn="0" w:firstRowLastColumn="0" w:lastRowFirstColumn="0" w:lastRowLastColumn="0"/>
             <w:tcW w:w="3264" w:type="dxa"/>
           </w:tcPr>
-          <w:p/>
+          <w:p>
+            <w:r>
+              <w:t>4</w:t>
+            </w:r>
+          </w:p>
         </w:tc>
         <w:tc>
           <w:tcPr>
@@ -254,7 +324,7 @@
               <w:cnfStyle w:val="000000000000" w:firstRow="0" w:lastRow="0" w:firstColumn="0" w:lastColumn="0" w:oddVBand="0" w:evenVBand="0" w:oddHBand="0" w:evenHBand="0" w:firstRowFirstColumn="0" w:firstRowLastColumn="0" w:lastRowFirstColumn="0" w:lastRowLastColumn="0"/>
             </w:pPr>
             <w:r>
-              <w:t>No GitHub Projects board is linked to the repository in the provided October 17 screenshot.</w:t>
+              <w:t>ATP cannot be executed without a running, implemented application and test data.</w:t>
             </w:r>
           </w:p>
         </w:tc>
@@ -269,55 +339,67 @@
           </w:p>
         </w:tc>
       </w:tr>
-      <w:tr>
-        <w:trPr>
-          <w:cnfStyle w:val="000000100000" w:firstRow="0" w:lastRow="0" w:firstColumn="0" w:lastColumn="0" w:oddVBand="0" w:evenVBand="0" w:oddHBand="1" w:evenHBand="0" w:firstRowFirstColumn="0" w:firstRowLastColumn="0" w:lastRowFirstColumn="0" w:lastRowLastColumn="0"/>
-          <w:jc w:val="center"/>
-        </w:trPr>
-        <w:tc>
-          <w:tcPr>
-            <w:cnfStyle w:val="001000000000" w:firstRow="0" w:lastRow="0" w:firstColumn="1" w:lastColumn="0" w:oddVBand="0" w:evenVBand="0" w:oddHBand="0" w:evenHBand="0" w:firstRowFirstColumn="0" w:firstRowLastColumn="0" w:lastRowFirstColumn="0" w:lastRowLastColumn="0"/>
-            <w:tcW w:w="3264" w:type="dxa"/>
-          </w:tcPr>
-          <w:p/>
-        </w:tc>
-        <w:tc>
-          <w:tcPr>
-            <w:tcW w:w="3264" w:type="dxa"/>
-          </w:tcPr>
-          <w:p>
-            <w:pPr>
-              <w:cnfStyle w:val="000000100000" w:firstRow="0" w:lastRow="0" w:firstColumn="0" w:lastColumn="0" w:oddVBand="0" w:evenVBand="0" w:oddHBand="1" w:evenHBand="0" w:firstRowFirstColumn="0" w:firstRowLastColumn="0" w:lastRowFirstColumn="0" w:lastRowLastColumn="0"/>
-            </w:pPr>
-            <w:r>
-              <w:t>ATP cannot be executed without a running, implemented application and test data.</w:t>
-            </w:r>
-          </w:p>
-        </w:tc>
-        <w:tc>
-          <w:tcPr>
-            <w:tcW w:w="3264" w:type="dxa"/>
-          </w:tcPr>
-          <w:p>
-            <w:pPr>
-              <w:cnfStyle w:val="000000100000" w:firstRow="0" w:lastRow="0" w:firstColumn="0" w:lastColumn="0" w:oddVBand="0" w:evenVBand="0" w:oddHBand="1" w:evenHBand="0" w:firstRowFirstColumn="0" w:firstRowLastColumn="0" w:lastRowFirstColumn="0" w:lastRowLastColumn="0"/>
-            </w:pPr>
-          </w:p>
-        </w:tc>
-      </w:tr>
     </w:tbl>
-    <w:p/>
-    <w:p/>
-    <w:p/>
-    <w:p/>
-    <w:p/>
     <w:p>
       <w:pPr>
         <w:pStyle w:val="Heading1"/>
       </w:pPr>
       <w:r>
-        <w:lastRenderedPageBreak/>
         <w:t>Version Identification</w:t>
+      </w:r>
+      <w:r>
+        <w:rPr>
+          <w:bCs w:val="0"/>
+          <w:noProof/>
+        </w:rPr>
+        <w:drawing>
+          <wp:inline distT="0" distB="0" distL="0" distR="0" wp14:anchorId="4632A541" wp14:editId="1FFA99B0">
+            <wp:extent cx="5070056" cy="4250418"/>
+            <wp:effectExtent l="0" t="0" r="0" b="4445"/>
+            <wp:docPr id="991816984" name="Picture 1"/>
+            <wp:cNvGraphicFramePr>
+              <a:graphicFrameLocks xmlns:a="http://schemas.openxmlformats.org/drawingml/2006/main" noChangeAspect="1"/>
+            </wp:cNvGraphicFramePr>
+            <a:graphic xmlns:a="http://schemas.openxmlformats.org/drawingml/2006/main">
+              <a:graphicData uri="http://schemas.openxmlformats.org/drawingml/2006/picture">
+                <pic:pic xmlns:pic="http://schemas.openxmlformats.org/drawingml/2006/picture">
+                  <pic:nvPicPr>
+                    <pic:cNvPr id="991816984" name="Picture 991816984"/>
+                    <pic:cNvPicPr/>
+                  </pic:nvPicPr>
+                  <pic:blipFill>
+                    <a:blip r:embed="rId7"/>
+                    <a:stretch>
+                      <a:fillRect/>
+                    </a:stretch>
+                  </pic:blipFill>
+                  <pic:spPr>
+                    <a:xfrm>
+                      <a:off x="0" y="0"/>
+                      <a:ext cx="5072221" cy="4252233"/>
+                    </a:xfrm>
+                    <a:prstGeom prst="rect">
+                      <a:avLst/>
+                    </a:prstGeom>
+                  </pic:spPr>
+                </pic:pic>
+              </a:graphicData>
+            </a:graphic>
+          </wp:inline>
+        </w:drawing>
+      </w:r>
+    </w:p>
+    <w:p>
+      <w:pPr>
+        <w:rPr>
+          <w:bCs/>
+        </w:rPr>
+      </w:pPr>
+      <w:r>
+        <w:rPr>
+          <w:bCs/>
+        </w:rPr>
+        <w:t>Figure 2: Main Repository Page.</w:t>
       </w:r>
     </w:p>
     <w:p>
@@ -336,18 +418,19 @@
         <w:rPr>
           <w:b/>
         </w:rPr>
-        <w:t xml:space="preserve">Known branch: </w:t>
+        <w:t xml:space="preserve">Repository activity: </w:t>
       </w:r>
       <w:r>
-        <w:t>main</w:t>
+        <w:rPr>
+          <w:bCs/>
+        </w:rPr>
+        <w:t>20 commits and 1 tag</w:t>
       </w:r>
-    </w:p>
-    <w:p>
       <w:r>
         <w:rPr>
           <w:b/>
         </w:rPr>
-        <w:t xml:space="preserve">Repository activity: 14 commits and no tags </w:t>
+        <w:t xml:space="preserve"> </w:t>
       </w:r>
     </w:p>
     <w:p>
@@ -357,20 +440,45 @@
         </w:rPr>
         <w:t xml:space="preserve">Specific delivery identifier: </w:t>
       </w:r>
+      <w:r>
+        <w:rPr>
+          <w:bCs/>
+        </w:rPr>
+        <w:t>Milestone-4-Acceptance Test Procedure</w:t>
+      </w:r>
     </w:p>
     <w:p>
+      <w:pPr>
+        <w:rPr>
+          <w:bCs/>
+        </w:rPr>
+      </w:pPr>
       <w:r>
         <w:rPr>
           <w:b/>
         </w:rPr>
         <w:t xml:space="preserve">Included files: </w:t>
       </w:r>
+      <w:r>
+        <w:rPr>
+          <w:bCs/>
+        </w:rPr>
+        <w:t>CST 326 Acceptance Test Milestone 4, CST 326 Version Description, CST 326 Technical Report Draft.</w:t>
+      </w:r>
+    </w:p>
+    <w:p>
+      <w:pPr>
+        <w:rPr>
+          <w:bCs/>
+        </w:rPr>
+      </w:pPr>
     </w:p>
     <w:p>
       <w:pPr>
         <w:pStyle w:val="Heading1"/>
       </w:pPr>
       <w:r>
+        <w:lastRenderedPageBreak/>
         <w:t>Sprint Capacity and Backlog Management Strategy</w:t>
       </w:r>
     </w:p>
@@ -381,9 +489,71 @@
     </w:p>
     <w:p>
       <w:r>
-        <w:t>For tracking, GitHub Projects can display issues in To Do, In Progress, and Done, while GitHub Issues records the scope and acceptance conditions. Review remaining hours and unfinished tasks together before taking on new work. Do not treat a completed document as a completed software feature.</w:t>
+        <w:t xml:space="preserve">For tracking, GitHub Projects can display issues in To Do, In Progress, and Done, while GitHub Issues records the scope and acceptance conditions. Review remaining hours and unfinished tasks together before taking on new work. </w:t>
       </w:r>
     </w:p>
+    <w:p>
+      <w:r>
+        <w:rPr>
+          <w:noProof/>
+        </w:rPr>
+        <w:drawing>
+          <wp:inline distT="0" distB="0" distL="0" distR="0" wp14:anchorId="54A5A232" wp14:editId="5A804578">
+            <wp:extent cx="6217920" cy="4266565"/>
+            <wp:effectExtent l="0" t="0" r="5080" b="635"/>
+            <wp:docPr id="166979362" name="Picture 2"/>
+            <wp:cNvGraphicFramePr>
+              <a:graphicFrameLocks xmlns:a="http://schemas.openxmlformats.org/drawingml/2006/main" noChangeAspect="1"/>
+            </wp:cNvGraphicFramePr>
+            <a:graphic xmlns:a="http://schemas.openxmlformats.org/drawingml/2006/main">
+              <a:graphicData uri="http://schemas.openxmlformats.org/drawingml/2006/picture">
+                <pic:pic xmlns:pic="http://schemas.openxmlformats.org/drawingml/2006/picture">
+                  <pic:nvPicPr>
+                    <pic:cNvPr id="166979362" name="Picture 166979362"/>
+                    <pic:cNvPicPr/>
+                  </pic:nvPicPr>
+                  <pic:blipFill>
+                    <a:blip r:embed="rId8"/>
+                    <a:stretch>
+                      <a:fillRect/>
+                    </a:stretch>
+                  </pic:blipFill>
+                  <pic:spPr>
+                    <a:xfrm>
+                      <a:off x="0" y="0"/>
+                      <a:ext cx="6217920" cy="4266565"/>
+                    </a:xfrm>
+                    <a:prstGeom prst="rect">
+                      <a:avLst/>
+                    </a:prstGeom>
+                  </pic:spPr>
+                </pic:pic>
+              </a:graphicData>
+            </a:graphic>
+          </wp:inline>
+        </w:drawing>
+      </w:r>
+    </w:p>
+    <w:p>
+      <w:r>
+        <w:t xml:space="preserve">Figure 3: </w:t>
+      </w:r>
+      <w:r>
+        <w:t>Sprint Board</w:t>
+      </w:r>
+      <w:r>
+        <w:t>.</w:t>
+      </w:r>
+    </w:p>
+    <w:p/>
+    <w:p/>
+    <w:p/>
+    <w:p/>
+    <w:p/>
+    <w:p/>
+    <w:p/>
+    <w:p/>
+    <w:p/>
     <w:tbl>
       <w:tblPr>
         <w:tblStyle w:val="LightShading-Accent1"/>
@@ -408,6 +578,7 @@
           </w:tcPr>
           <w:p>
             <w:r>
+              <w:lastRenderedPageBreak/>
               <w:t>Sprint measurement</w:t>
             </w:r>
           </w:p>
@@ -434,7 +605,7 @@
               <w:cnfStyle w:val="100000000000" w:firstRow="1" w:lastRow="0" w:firstColumn="0" w:lastColumn="0" w:oddVBand="0" w:evenVBand="0" w:oddHBand="0" w:evenHBand="0" w:firstRowFirstColumn="0" w:firstRowLastColumn="0" w:lastRowFirstColumn="0" w:lastRowLastColumn="0"/>
             </w:pPr>
             <w:r>
-              <w:t>Sprint data</w:t>
+              <w:t>Source</w:t>
             </w:r>
           </w:p>
         </w:tc>
@@ -464,7 +635,10 @@
               <w:cnfStyle w:val="000000100000" w:firstRow="0" w:lastRow="0" w:firstColumn="0" w:lastColumn="0" w:oddVBand="0" w:evenVBand="0" w:oddHBand="1" w:evenHBand="0" w:firstRowFirstColumn="0" w:firstRowLastColumn="0" w:lastRowFirstColumn="0" w:lastRowLastColumn="0"/>
             </w:pPr>
             <w:r>
-              <w:t>2 contributors named in technical design</w:t>
+              <w:t xml:space="preserve">2 contributors </w:t>
+            </w:r>
+            <w:r>
+              <w:t>(Devin Puckett and Justin Albecker</w:t>
             </w:r>
           </w:p>
         </w:tc>
@@ -476,6 +650,9 @@
             <w:pPr>
               <w:cnfStyle w:val="000000100000" w:firstRow="0" w:lastRow="0" w:firstColumn="0" w:lastColumn="0" w:oddVBand="0" w:evenVBand="0" w:oddHBand="1" w:evenHBand="0" w:firstRowFirstColumn="0" w:firstRowLastColumn="0" w:lastRowFirstColumn="0" w:lastRowLastColumn="0"/>
             </w:pPr>
+            <w:r>
+              <w:t>GitHub collaborators</w:t>
+            </w:r>
           </w:p>
         </w:tc>
       </w:tr>
@@ -503,7 +680,7 @@
               <w:cnfStyle w:val="000000000000" w:firstRow="0" w:lastRow="0" w:firstColumn="0" w:lastColumn="0" w:oddVBand="0" w:evenVBand="0" w:oddHBand="0" w:evenHBand="0" w:firstRowFirstColumn="0" w:firstRowLastColumn="0" w:lastRowFirstColumn="0" w:lastRowLastColumn="0"/>
             </w:pPr>
             <w:r>
-              <w:t>14 commits in supplied screenshot</w:t>
+              <w:t>20 commits and 1 release tag</w:t>
             </w:r>
           </w:p>
         </w:tc>
@@ -515,6 +692,9 @@
             <w:pPr>
               <w:cnfStyle w:val="000000000000" w:firstRow="0" w:lastRow="0" w:firstColumn="0" w:lastColumn="0" w:oddVBand="0" w:evenVBand="0" w:oddHBand="0" w:evenHBand="0" w:firstRowFirstColumn="0" w:firstRowLastColumn="0" w:lastRowFirstColumn="0" w:lastRowLastColumn="0"/>
             </w:pPr>
+            <w:r>
+              <w:t>GitHub repository</w:t>
+            </w:r>
           </w:p>
         </w:tc>
       </w:tr>
@@ -543,7 +723,7 @@
               <w:cnfStyle w:val="000000100000" w:firstRow="0" w:lastRow="0" w:firstColumn="0" w:lastColumn="0" w:oddVBand="0" w:evenVBand="0" w:oddHBand="1" w:evenHBand="0" w:firstRowFirstColumn="0" w:firstRowLastColumn="0" w:lastRowFirstColumn="0" w:lastRowLastColumn="0"/>
             </w:pPr>
             <w:r>
-              <w:t>None in supplied screenshot</w:t>
+              <w:t>Equipment Inventory – Sprint Board, 10 issues tracked</w:t>
             </w:r>
           </w:p>
         </w:tc>
@@ -555,6 +735,9 @@
             <w:pPr>
               <w:cnfStyle w:val="000000100000" w:firstRow="0" w:lastRow="0" w:firstColumn="0" w:lastColumn="0" w:oddVBand="0" w:evenVBand="0" w:oddHBand="1" w:evenHBand="0" w:firstRowFirstColumn="0" w:firstRowLastColumn="0" w:lastRowFirstColumn="0" w:lastRowLastColumn="0"/>
             </w:pPr>
+            <w:r>
+              <w:t>GitHub Projects</w:t>
+            </w:r>
           </w:p>
         </w:tc>
       </w:tr>
@@ -569,7 +752,7 @@
           </w:tcPr>
           <w:p>
             <w:r>
-              <w:t>Planned vs. completed effort</w:t>
+              <w:t>Milestone 4 planned effort</w:t>
             </w:r>
           </w:p>
         </w:tc>
@@ -582,7 +765,13 @@
               <w:cnfStyle w:val="000000000000" w:firstRow="0" w:lastRow="0" w:firstColumn="0" w:lastColumn="0" w:oddVBand="0" w:evenVBand="0" w:oddHBand="0" w:evenHBand="0" w:firstRowFirstColumn="0" w:firstRowLastColumn="0" w:lastRowFirstColumn="0" w:lastRowLastColumn="0"/>
             </w:pPr>
             <w:r>
-              <w:t>Not provided</w:t>
+              <w:t>6 issues, 1</w:t>
+            </w:r>
+            <w:r>
+              <w:t>3</w:t>
+            </w:r>
+            <w:r>
+              <w:t xml:space="preserve"> estimated hours</w:t>
             </w:r>
           </w:p>
         </w:tc>
@@ -594,6 +783,126 @@
             <w:pPr>
               <w:cnfStyle w:val="000000000000" w:firstRow="0" w:lastRow="0" w:firstColumn="0" w:lastColumn="0" w:oddVBand="0" w:evenVBand="0" w:oddHBand="0" w:evenHBand="0" w:firstRowFirstColumn="0" w:firstRowLastColumn="0" w:lastRowFirstColumn="0" w:lastRowLastColumn="0"/>
             </w:pPr>
+            <w:r>
+              <w:t xml:space="preserve">Sprint </w:t>
+            </w:r>
+            <w:r>
+              <w:t>Board</w:t>
+            </w:r>
+            <w:r>
+              <w:t xml:space="preserve"> (Figure </w:t>
+            </w:r>
+            <w:r>
+              <w:t>3</w:t>
+            </w:r>
+            <w:r>
+              <w:t>)</w:t>
+            </w:r>
+          </w:p>
+        </w:tc>
+      </w:tr>
+      <w:tr>
+        <w:trPr>
+          <w:cnfStyle w:val="000000100000" w:firstRow="0" w:lastRow="0" w:firstColumn="0" w:lastColumn="0" w:oddVBand="0" w:evenVBand="0" w:oddHBand="1" w:evenHBand="0" w:firstRowFirstColumn="0" w:firstRowLastColumn="0" w:lastRowFirstColumn="0" w:lastRowLastColumn="0"/>
+          <w:jc w:val="center"/>
+        </w:trPr>
+        <w:tc>
+          <w:tcPr>
+            <w:cnfStyle w:val="001000000000" w:firstRow="0" w:lastRow="0" w:firstColumn="1" w:lastColumn="0" w:oddVBand="0" w:evenVBand="0" w:oddHBand="0" w:evenHBand="0" w:firstRowFirstColumn="0" w:firstRowLastColumn="0" w:lastRowFirstColumn="0" w:lastRowLastColumn="0"/>
+            <w:tcW w:w="3264" w:type="dxa"/>
+          </w:tcPr>
+          <w:p>
+            <w:r>
+              <w:t>Milestone 4 Completed effort</w:t>
+            </w:r>
+          </w:p>
+        </w:tc>
+        <w:tc>
+          <w:tcPr>
+            <w:tcW w:w="3264" w:type="dxa"/>
+          </w:tcPr>
+          <w:p>
+            <w:pPr>
+              <w:cnfStyle w:val="000000100000" w:firstRow="0" w:lastRow="0" w:firstColumn="0" w:lastColumn="0" w:oddVBand="0" w:evenVBand="0" w:oddHBand="1" w:evenHBand="0" w:firstRowFirstColumn="0" w:firstRowLastColumn="0" w:lastRowFirstColumn="0" w:lastRowLastColumn="0"/>
+            </w:pPr>
+            <w:r>
+              <w:t xml:space="preserve">2 issues closed (#4, #6), 6.5 </w:t>
+            </w:r>
+            <w:proofErr w:type="spellStart"/>
+            <w:r>
+              <w:t>hrs</w:t>
+            </w:r>
+            <w:proofErr w:type="spellEnd"/>
+            <w:r>
+              <w:t>, 4 in progress</w:t>
+            </w:r>
+          </w:p>
+        </w:tc>
+        <w:tc>
+          <w:tcPr>
+            <w:tcW w:w="3264" w:type="dxa"/>
+          </w:tcPr>
+          <w:p>
+            <w:pPr>
+              <w:cnfStyle w:val="000000100000" w:firstRow="0" w:lastRow="0" w:firstColumn="0" w:lastColumn="0" w:oddVBand="0" w:evenVBand="0" w:oddHBand="1" w:evenHBand="0" w:firstRowFirstColumn="0" w:firstRowLastColumn="0" w:lastRowFirstColumn="0" w:lastRowLastColumn="0"/>
+            </w:pPr>
+            <w:r>
+              <w:t xml:space="preserve">Sprint </w:t>
+            </w:r>
+            <w:r>
+              <w:t>Board</w:t>
+            </w:r>
+            <w:r>
+              <w:t xml:space="preserve"> (Figure </w:t>
+            </w:r>
+            <w:r>
+              <w:t>3</w:t>
+            </w:r>
+            <w:r>
+              <w:t>)</w:t>
+            </w:r>
+          </w:p>
+        </w:tc>
+      </w:tr>
+      <w:tr>
+        <w:trPr>
+          <w:jc w:val="center"/>
+        </w:trPr>
+        <w:tc>
+          <w:tcPr>
+            <w:cnfStyle w:val="001000000000" w:firstRow="0" w:lastRow="0" w:firstColumn="1" w:lastColumn="0" w:oddVBand="0" w:evenVBand="0" w:oddHBand="0" w:evenHBand="0" w:firstRowFirstColumn="0" w:firstRowLastColumn="0" w:lastRowFirstColumn="0" w:lastRowLastColumn="0"/>
+            <w:tcW w:w="3264" w:type="dxa"/>
+          </w:tcPr>
+          <w:p>
+            <w:r>
+              <w:t>Deferred to Future Sprint</w:t>
+            </w:r>
+          </w:p>
+        </w:tc>
+        <w:tc>
+          <w:tcPr>
+            <w:tcW w:w="3264" w:type="dxa"/>
+          </w:tcPr>
+          <w:p>
+            <w:pPr>
+              <w:cnfStyle w:val="000000000000" w:firstRow="0" w:lastRow="0" w:firstColumn="0" w:lastColumn="0" w:oddVBand="0" w:evenVBand="0" w:oddHBand="0" w:evenHBand="0" w:firstRowFirstColumn="0" w:firstRowLastColumn="0" w:lastRowFirstColumn="0" w:lastRowLastColumn="0"/>
+            </w:pPr>
+            <w:r>
+              <w:t>4 issues (#1, #2, #3, #10)</w:t>
+            </w:r>
+          </w:p>
+        </w:tc>
+        <w:tc>
+          <w:tcPr>
+            <w:tcW w:w="3264" w:type="dxa"/>
+          </w:tcPr>
+          <w:p>
+            <w:pPr>
+              <w:cnfStyle w:val="000000000000" w:firstRow="0" w:lastRow="0" w:firstColumn="0" w:lastColumn="0" w:oddVBand="0" w:evenVBand="0" w:oddHBand="0" w:evenHBand="0" w:firstRowFirstColumn="0" w:firstRowLastColumn="0" w:lastRowFirstColumn="0" w:lastRowLastColumn="0"/>
+            </w:pPr>
+            <w:r>
+              <w:t>Milestone: Future Sprint</w:t>
+            </w:r>
           </w:p>
         </w:tc>
       </w:tr>
@@ -610,11 +919,28 @@
     <w:p/>
     <w:p/>
     <w:p/>
+    <w:p/>
+    <w:p/>
+    <w:p/>
+    <w:p/>
+    <w:p/>
+    <w:p/>
+    <w:p/>
+    <w:p/>
+    <w:p/>
+    <w:p/>
+    <w:p/>
+    <w:p/>
+    <w:p/>
+    <w:p/>
+    <w:p/>
+    <w:p/>
     <w:p>
       <w:pPr>
         <w:pStyle w:val="Heading1"/>
       </w:pPr>
       <w:r>
+        <w:lastRenderedPageBreak/>
         <w:t>References</w:t>
       </w:r>
     </w:p>
@@ -639,7 +965,7 @@
 </file>
 
 <file path=word/numbering.xml><?xml version="1.0" encoding="utf-8"?>
-<w:numbering xmlns:wpc="http://schemas.microsoft.com/office/word/2010/wordprocessingCanvas" xmlns:cx="http://schemas.microsoft.com/office/drawing/2014/chartex" xmlns:cx1="http://schemas.microsoft.com/office/drawing/2015/9/8/chartex" xmlns:cx2="http://schemas.microsoft.com/office/drawing/2015/10/21/chartex" xmlns:cx3="http://schemas.microsoft.com/office/drawing/2016/5/9/chartex" xmlns:cx4="http://schemas.microsoft.com/office/drawing/2016/5/10/chartex" xmlns:cx5="http://schemas.microsoft.com/office/drawing/2016/5/11/chartex" xmlns:cx6="http://schemas.microsoft.com/office/drawing/2016/5/12/chartex" xmlns:cx7="http://schemas.microsoft.com/office/drawing/2016/5/13/chartex" xmlns:cx8="http://schemas.microsoft.com/office/drawing/2016/5/14/chartex" xmlns:mc="http://schemas.openxmlformats.org/markup-compatibility/2006" xmlns:aink="http://schemas.microsoft.com/office/drawing/2016/ink" xmlns:am3d="http://schemas.microsoft.com/office/drawing/2017/model3d" xmlns:o="urn:schemas-microsoft-com:office:office" xmlns:oel="http://schemas.microsoft.com/office/2019/extlst" xmlns:r="http://schemas.openxmlformats.org/officeDocument/2006/relationships" xmlns:m="http://schemas.openxmlformats.org/officeDocument/2006/math" xmlns:v="urn:schemas-microsoft-com:vml" xmlns:wp14="http://schemas.microsoft.com/office/word/2010/wordprocessingDrawing" xmlns:wp="http://schemas.openxmlformats.org/drawingml/2006/wordprocessingDrawing" xmlns:w10="urn:schemas-microsoft-com:office:word" xmlns:w="http://schemas.openxmlformats.org/wordprocessingml/2006/main" xmlns:w14="http://schemas.microsoft.com/office/word/2010/wordml" xmlns:w15="http://schemas.microsoft.com/office/word/2012/wordml" xmlns:w16cex="http://schemas.microsoft.com/office/word/2018/wordml/cex" xmlns:w16cid="http://schemas.microsoft.com/office/word/2016/wordml/cid" xmlns:w16="http://schemas.microsoft.com/office/word/2018/wordml" xmlns:w16du="http://schemas.microsoft.com/office/word/2023/wordml/word16du" xmlns:w16sdtdh="http://schemas.microsoft.com/office/word/2020/wordml/sdtdatahash" xmlns:w16sdtfl="http://schemas.microsoft.com/office/word/2024/wordml/sdtformatlock" xmlns:w16se="http://schemas.microsoft.com/office/word/2015/wordml/symex" xmlns:wpg="http://schemas.microsoft.com/office/word/2010/wordprocessingGroup" xmlns:wpi="http://schemas.microsoft.com/office/word/2010/wordprocessingInk" xmlns:wne="http://schemas.microsoft.com/office/word/2006/wordml" xmlns:wps="http://schemas.microsoft.com/office/word/2010/wordprocessingShape" mc:Ignorable="w14 w15 w16se w16cid w16 w16cex w16sdtdh w16sdtfl w16du wp14">
+<w:numbering xmlns:wpc="http://schemas.microsoft.com/office/word/2010/wordprocessingCanvas" xmlns:cx="http://schemas.microsoft.com/office/drawing/2014/chartex" xmlns:cx1="http://schemas.microsoft.com/office/drawing/2015/9/8/chartex" xmlns:cx2="http://schemas.microsoft.com/office/drawing/2015/10/21/chartex" xmlns:cx3="http://schemas.microsoft.com/office/drawing/2016/5/9/chartex" xmlns:cx4="http://schemas.microsoft.com/office/drawing/2016/5/10/chartex" xmlns:cx5="http://schemas.microsoft.com/office/drawing/2016/5/11/chartex" xmlns:cx6="http://schemas.microsoft.com/office/drawing/2016/5/12/chartex" xmlns:cx7="http://schemas.microsoft.com/office/drawing/2016/5/13/chartex" xmlns:cx8="http://schemas.microsoft.com/office/drawing/2016/5/14/chartex" xmlns:mc="http://schemas.openxmlformats.org/markup-compatibility/2006" xmlns:m="http://schemas.openxmlformats.org/officeDocument/2006/math" xmlns:aink="http://schemas.microsoft.com/office/drawing/2016/ink" xmlns:am3d="http://schemas.microsoft.com/office/drawing/2017/model3d" xmlns:oel="http://schemas.microsoft.com/office/2019/extlst" xmlns:r="http://schemas.openxmlformats.org/officeDocument/2006/relationships" xmlns:wp14="http://schemas.microsoft.com/office/word/2010/wordprocessingDrawing" xmlns:wp="http://schemas.openxmlformats.org/drawingml/2006/wordprocessingDrawing" xmlns:wpg="http://schemas.microsoft.com/office/word/2010/wordprocessingGroup" xmlns:wpi="http://schemas.microsoft.com/office/word/2010/wordprocessingInk" xmlns:wps="http://schemas.microsoft.com/office/word/2010/wordprocessingShape" xmlns:o="urn:schemas-microsoft-com:office:office" xmlns:v="urn:schemas-microsoft-com:vml" xmlns:w10="urn:schemas-microsoft-com:office:word" xmlns:w="http://schemas.openxmlformats.org/wordprocessingml/2006/main" xmlns:w14="http://schemas.microsoft.com/office/word/2010/wordml" xmlns:w15="http://schemas.microsoft.com/office/word/2012/wordml" xmlns:w16cex="http://schemas.microsoft.com/office/word/2018/wordml/cex" xmlns:w16cid="http://schemas.microsoft.com/office/word/2016/wordml/cid" xmlns:w16="http://schemas.microsoft.com/office/word/2018/wordml" xmlns:w16sdtdh="http://schemas.microsoft.com/office/word/2020/wordml/sdtdatahash" xmlns:w16sdtfl="http://schemas.microsoft.com/office/word/2024/wordml/sdtformatlock" xmlns:w16se="http://schemas.microsoft.com/office/word/2015/wordml/symex" xmlns:w16du="http://schemas.microsoft.com/office/word/2023/wordml/word16du" xmlns:wne="http://schemas.microsoft.com/office/word/2006/wordml" mc:Ignorable="w14 w15 w16se w16cid w16 w16cex w16sdtdh w16sdtfl w16du wp14">
   <w:abstractNum w:abstractNumId="0" w15:restartNumberingAfterBreak="0">
     <w:nsid w:val="FFFFFF7C"/>
     <w:multiLevelType w:val="singleLevel"/>
@@ -842,7 +1168,7 @@
 </file>
 
 <file path=word/styles.xml><?xml version="1.0" encoding="utf-8"?>
-<w:styles xmlns:mc="http://schemas.openxmlformats.org/markup-compatibility/2006" xmlns:r="http://schemas.openxmlformats.org/officeDocument/2006/relationships" xmlns:w="http://schemas.openxmlformats.org/wordprocessingml/2006/main" xmlns:w14="http://schemas.microsoft.com/office/word/2010/wordml" xmlns:w15="http://schemas.microsoft.com/office/word/2012/wordml" xmlns:w16cex="http://schemas.microsoft.com/office/word/2018/wordml/cex" xmlns:w16cid="http://schemas.microsoft.com/office/word/2016/wordml/cid" xmlns:w16="http://schemas.microsoft.com/office/word/2018/wordml" xmlns:w16du="http://schemas.microsoft.com/office/word/2023/wordml/word16du" xmlns:w16sdtdh="http://schemas.microsoft.com/office/word/2020/wordml/sdtdatahash" xmlns:w16sdtfl="http://schemas.microsoft.com/office/word/2024/wordml/sdtformatlock" xmlns:w16se="http://schemas.microsoft.com/office/word/2015/wordml/symex" mc:Ignorable="w14 w15 w16se w16cid w16 w16cex w16sdtdh w16sdtfl w16du">
+<w:styles xmlns:mc="http://schemas.openxmlformats.org/markup-compatibility/2006" xmlns:r="http://schemas.openxmlformats.org/officeDocument/2006/relationships" xmlns:w="http://schemas.openxmlformats.org/wordprocessingml/2006/main" xmlns:w14="http://schemas.microsoft.com/office/word/2010/wordml" xmlns:w15="http://schemas.microsoft.com/office/word/2012/wordml" xmlns:w16cex="http://schemas.microsoft.com/office/word/2018/wordml/cex" xmlns:w16cid="http://schemas.microsoft.com/office/word/2016/wordml/cid" xmlns:w16="http://schemas.microsoft.com/office/word/2018/wordml" xmlns:w16sdtdh="http://schemas.microsoft.com/office/word/2020/wordml/sdtdatahash" xmlns:w16sdtfl="http://schemas.microsoft.com/office/word/2024/wordml/sdtformatlock" xmlns:w16se="http://schemas.microsoft.com/office/word/2015/wordml/symex" xmlns:w16du="http://schemas.microsoft.com/office/word/2023/wordml/word16du" mc:Ignorable="w14 w15 w16se w16cid w16 w16cex w16sdtdh w16sdtfl w16du">
   <w:docDefaults>
     <w:rPrDefault>
       <w:rPr>

</xml_diff>